<commit_message>
Added a link to the report
A link to the original Oscar_Report made with Google Looker Studio online tool has been added to the Word file.
</commit_message>
<xml_diff>
--- a/Relazione_Oscar_Analysis.docx
+++ b/Relazione_Oscar_Analysis.docx
@@ -79,6 +79,110 @@
         <w:jc w:val="both"/>
       </w:pPr>
       <w:r>
+        <w:t>La presente relazione documenta il lavoro di preparazione, pulizia e trasformazione dei dati svolto in Power Query, propedeutico alla fase di analisi.</w:t>
+      </w:r>
+    </w:p>
+    <w:p>
+      <w:pPr>
+        <w:shd w:val="clear" w:color="auto" w:fill="E8E8E8" w:themeFill="background2"/>
+        <w:spacing w:after="120" w:line="276" w:lineRule="auto"/>
+        <w:jc w:val="both"/>
+        <w:rPr>
+          <w:b/>
+          <w:bCs/>
+        </w:rPr>
+      </w:pPr>
+      <w:r>
+        <w:rPr>
+          <w:b/>
+          <w:bCs/>
+        </w:rPr>
+        <w:t xml:space="preserve">Per visualizzare il report interattivo </w:t>
+      </w:r>
+      <w:r>
+        <w:rPr>
+          <w:b/>
+          <w:bCs/>
+        </w:rPr>
+        <w:t>presentato con Google Looker Studio, cliccare al seguente link:</w:t>
+      </w:r>
+    </w:p>
+    <w:p>
+      <w:pPr>
+        <w:shd w:val="clear" w:color="auto" w:fill="E8E8E8" w:themeFill="background2"/>
+        <w:spacing w:after="120" w:line="276" w:lineRule="auto"/>
+        <w:jc w:val="both"/>
+        <w:rPr>
+          <w:rStyle w:val="Hyperlink"/>
+        </w:rPr>
+      </w:pPr>
+      <w:r>
+        <w:fldChar w:fldCharType="begin"/>
+      </w:r>
+      <w:r>
+        <w:instrText>HYPERLINK "https://datastudio.google.com/reporting/6d6f5e05-adff-45e6-ade1-2814b72bef25"</w:instrText>
+      </w:r>
+      <w:r>
+        <w:fldChar w:fldCharType="separate"/>
+      </w:r>
+      <w:proofErr w:type="spellStart"/>
+      <w:r>
+        <w:rPr>
+          <w:rStyle w:val="Hyperlink"/>
+        </w:rPr>
+        <w:t>Oscar_DataAna</w:t>
+      </w:r>
+      <w:r>
+        <w:rPr>
+          <w:rStyle w:val="Hyperlink"/>
+        </w:rPr>
+        <w:t>l</w:t>
+      </w:r>
+      <w:r>
+        <w:rPr>
+          <w:rStyle w:val="Hyperlink"/>
+        </w:rPr>
+        <w:t>ys</w:t>
+      </w:r>
+      <w:r>
+        <w:rPr>
+          <w:rStyle w:val="Hyperlink"/>
+        </w:rPr>
+        <w:t>i</w:t>
+      </w:r>
+      <w:r>
+        <w:rPr>
+          <w:rStyle w:val="Hyperlink"/>
+        </w:rPr>
+        <w:t>s</w:t>
+      </w:r>
+      <w:proofErr w:type="spellEnd"/>
+    </w:p>
+    <w:p>
+      <w:pPr>
+        <w:pStyle w:val="Heading1"/>
+        <w:jc w:val="both"/>
+      </w:pPr>
+      <w:r>
+        <w:rPr>
+          <w:b w:val="0"/>
+          <w:bCs w:val="0"/>
+          <w:color w:val="1A1A1A"/>
+          <w:sz w:val="22"/>
+          <w:szCs w:val="22"/>
+        </w:rPr>
+        <w:fldChar w:fldCharType="end"/>
+      </w:r>
+      <w:r>
+        <w:t>2. Scrematura delle tabelle Oscar</w:t>
+      </w:r>
+    </w:p>
+    <w:p>
+      <w:pPr>
+        <w:spacing w:after="120" w:line="276" w:lineRule="auto"/>
+        <w:jc w:val="both"/>
+      </w:pPr>
+      <w:r>
         <w:t>Il dataset di partenza era costituito da numerose tabelle delle categorie Oscar (una per categoria, con suffisso “_</w:t>
       </w:r>
       <w:proofErr w:type="spellStart"/>
@@ -95,16 +199,7 @@
       </w:r>
       <w:proofErr w:type="spellEnd"/>
       <w:r>
-        <w:t>”). La presente relazione documenta il lavoro di preparazione, pulizia e trasformazione dei dati svolto in Power Query, propedeutico alla fase di analisi.</w:t>
-      </w:r>
-    </w:p>
-    <w:p>
-      <w:pPr>
-        <w:pStyle w:val="Heading1"/>
-        <w:jc w:val="both"/>
-      </w:pPr>
-      <w:r>
-        <w:t>2. Scrematura delle tabelle Oscar</w:t>
+        <w:t xml:space="preserve">”). </w:t>
       </w:r>
     </w:p>
     <w:p>
@@ -1011,6 +1106,7 @@
         <w:jc w:val="both"/>
       </w:pPr>
       <w:r>
+        <w:lastRenderedPageBreak/>
         <w:t>2.2 Tabelle eliminate e motivazioni</w:t>
       </w:r>
     </w:p>
@@ -1068,7 +1164,6 @@
           <w:b/>
           <w:bCs/>
         </w:rPr>
-        <w:lastRenderedPageBreak/>
         <w:t xml:space="preserve">Categorie fuori mercato </w:t>
       </w:r>
       <w:r>
@@ -1425,6 +1520,7 @@
         <w:jc w:val="both"/>
       </w:pPr>
       <w:r>
+        <w:lastRenderedPageBreak/>
         <w:t>La tabella dei film (</w:t>
       </w:r>
       <w:proofErr w:type="spellStart"/>
@@ -1448,7 +1544,6 @@
         <w:jc w:val="both"/>
       </w:pPr>
       <w:r>
-        <w:lastRenderedPageBreak/>
         <w:t>5.1 Lavorazione della data di uscita</w:t>
       </w:r>
     </w:p>
@@ -1850,6 +1945,7 @@
         <w:jc w:val="both"/>
       </w:pPr>
       <w:r>
+        <w:lastRenderedPageBreak/>
         <w:t xml:space="preserve">7. Collegamento delle tabelle: la join </w:t>
       </w:r>
       <w:proofErr w:type="spellStart"/>
@@ -1892,7 +1988,6 @@
         <w:jc w:val="both"/>
       </w:pPr>
       <w:r>
-        <w:lastRenderedPageBreak/>
         <w:t xml:space="preserve">È stato realizzato un </w:t>
       </w:r>
       <w:proofErr w:type="spellStart"/>
@@ -2063,6 +2158,7 @@
         <w:rPr>
           <w:noProof/>
         </w:rPr>
+        <w:lastRenderedPageBreak/>
         <w:drawing>
           <wp:inline distT="0" distB="0" distL="0" distR="0" wp14:anchorId="482DCFE7" wp14:editId="3BBBC5ED">
             <wp:extent cx="5492750" cy="3600450"/>
@@ -2159,60 +2255,60 @@
         <w:jc w:val="both"/>
       </w:pPr>
       <w:r>
+        <w:t xml:space="preserve">8.2 Pagina 2 — Albo dei vincitori (sorgente: </w:t>
+      </w:r>
+      <w:proofErr w:type="spellStart"/>
+      <w:r>
+        <w:t>Oscar_Winners</w:t>
+      </w:r>
+      <w:proofErr w:type="spellEnd"/>
+      <w:r>
+        <w:t>)</w:t>
+      </w:r>
+    </w:p>
+    <w:p>
+      <w:pPr>
+        <w:spacing w:after="120" w:line="276" w:lineRule="auto"/>
+        <w:jc w:val="both"/>
+      </w:pPr>
+      <w:r>
+        <w:t xml:space="preserve">La seconda pagina presenta l'albo d'oro per figura professionale, con sei tabelle distinte alimentate dalla sola tabella </w:t>
+      </w:r>
+      <w:proofErr w:type="spellStart"/>
+      <w:r>
+        <w:t>Oscar_Winners</w:t>
+      </w:r>
+      <w:proofErr w:type="spellEnd"/>
+      <w:r>
+        <w:t xml:space="preserve">: Best Actors, Best </w:t>
+      </w:r>
+      <w:proofErr w:type="spellStart"/>
+      <w:r>
+        <w:t>Actress</w:t>
+      </w:r>
+      <w:proofErr w:type="spellEnd"/>
+      <w:r>
+        <w:t xml:space="preserve">, Best Directors, Best </w:t>
+      </w:r>
+      <w:proofErr w:type="spellStart"/>
+      <w:r>
+        <w:t>Screenwriters</w:t>
+      </w:r>
+      <w:proofErr w:type="spellEnd"/>
+      <w:r>
+        <w:t>, Best Producers e Best Visual Artists. Ciascuna riporta anno e vincitore (Winners), filtrabili per anno, film e nome. Questa pagina risponde al primo obiettivo dell'analisi — individuare chi coinvolgere — offrendo una lettura immediata di chi ha vinto in ogni ruolo dal 2000 al 2023.</w:t>
+      </w:r>
+    </w:p>
+    <w:p>
+      <w:pPr>
+        <w:spacing w:before="120" w:after="40"/>
+        <w:jc w:val="both"/>
+      </w:pPr>
+      <w:r>
+        <w:rPr>
+          <w:noProof/>
+        </w:rPr>
         <w:lastRenderedPageBreak/>
-        <w:t xml:space="preserve">8.2 Pagina 2 — Albo dei vincitori (sorgente: </w:t>
-      </w:r>
-      <w:proofErr w:type="spellStart"/>
-      <w:r>
-        <w:t>Oscar_Winners</w:t>
-      </w:r>
-      <w:proofErr w:type="spellEnd"/>
-      <w:r>
-        <w:t>)</w:t>
-      </w:r>
-    </w:p>
-    <w:p>
-      <w:pPr>
-        <w:spacing w:after="120" w:line="276" w:lineRule="auto"/>
-        <w:jc w:val="both"/>
-      </w:pPr>
-      <w:r>
-        <w:t xml:space="preserve">La seconda pagina presenta l'albo d'oro per figura professionale, con sei tabelle distinte alimentate dalla sola tabella </w:t>
-      </w:r>
-      <w:proofErr w:type="spellStart"/>
-      <w:r>
-        <w:t>Oscar_Winners</w:t>
-      </w:r>
-      <w:proofErr w:type="spellEnd"/>
-      <w:r>
-        <w:t xml:space="preserve">: Best Actors, Best </w:t>
-      </w:r>
-      <w:proofErr w:type="spellStart"/>
-      <w:r>
-        <w:t>Actress</w:t>
-      </w:r>
-      <w:proofErr w:type="spellEnd"/>
-      <w:r>
-        <w:t xml:space="preserve">, Best Directors, Best </w:t>
-      </w:r>
-      <w:proofErr w:type="spellStart"/>
-      <w:r>
-        <w:t>Screenwriters</w:t>
-      </w:r>
-      <w:proofErr w:type="spellEnd"/>
-      <w:r>
-        <w:t>, Best Producers e Best Visual Artists. Ciascuna riporta anno e vincitore (Winners), filtrabili per anno, film e nome. Questa pagina risponde al primo obiettivo dell'analisi — individuare chi coinvolgere — offrendo una lettura immediata di chi ha vinto in ogni ruolo dal 2000 al 2023.</w:t>
-      </w:r>
-    </w:p>
-    <w:p>
-      <w:pPr>
-        <w:spacing w:before="120" w:after="40"/>
-        <w:jc w:val="both"/>
-      </w:pPr>
-      <w:r>
-        <w:rPr>
-          <w:noProof/>
-        </w:rPr>
         <w:drawing>
           <wp:inline distT="0" distB="0" distL="0" distR="0" wp14:anchorId="785229D3" wp14:editId="031B6F41">
             <wp:extent cx="5143500" cy="3705225"/>
@@ -2370,7 +2466,6 @@
         <w:rPr>
           <w:noProof/>
         </w:rPr>
-        <w:lastRenderedPageBreak/>
         <w:drawing>
           <wp:inline distT="0" distB="0" distL="0" distR="0" wp14:anchorId="4E87BDCB" wp14:editId="5319FE07">
             <wp:extent cx="4044950" cy="2913862"/>
@@ -2433,6 +2528,7 @@
         <w:jc w:val="both"/>
       </w:pPr>
       <w:r>
+        <w:lastRenderedPageBreak/>
         <w:t>8.4 Lettura d'insieme</w:t>
       </w:r>
     </w:p>
@@ -3509,6 +3605,30 @@
     <w:uiPriority w:val="99"/>
     <w:rsid w:val="008C1B90"/>
   </w:style>
+  <w:style w:type="character" w:styleId="UnresolvedMention">
+    <w:name w:val="Unresolved Mention"/>
+    <w:basedOn w:val="DefaultParagraphFont"/>
+    <w:uiPriority w:val="99"/>
+    <w:semiHidden/>
+    <w:unhideWhenUsed/>
+    <w:rsid w:val="009B7F4C"/>
+    <w:rPr>
+      <w:color w:val="605E5C"/>
+      <w:shd w:val="clear" w:color="auto" w:fill="E1DFDD"/>
+    </w:rPr>
+  </w:style>
+  <w:style w:type="character" w:styleId="FollowedHyperlink">
+    <w:name w:val="FollowedHyperlink"/>
+    <w:basedOn w:val="DefaultParagraphFont"/>
+    <w:uiPriority w:val="99"/>
+    <w:semiHidden/>
+    <w:unhideWhenUsed/>
+    <w:rsid w:val="00CA386B"/>
+    <w:rPr>
+      <w:color w:val="96607D" w:themeColor="followedHyperlink"/>
+      <w:u w:val="single"/>
+    </w:rPr>
+  </w:style>
 </w:styles>
 </file>
 

</xml_diff>

<commit_message>
Aggiunti consigli finali e rimosse ripetizioni
</commit_message>
<xml_diff>
--- a/Relazione_Oscar_Analysis.docx
+++ b/Relazione_Oscar_Analysis.docx
@@ -130,31 +130,7 @@
         <w:rPr>
           <w:rStyle w:val="Hyperlink"/>
         </w:rPr>
-        <w:t>Oscar_DataAna</w:t>
-      </w:r>
-      <w:r>
-        <w:rPr>
-          <w:rStyle w:val="Hyperlink"/>
-        </w:rPr>
-        <w:t>l</w:t>
-      </w:r>
-      <w:r>
-        <w:rPr>
-          <w:rStyle w:val="Hyperlink"/>
-        </w:rPr>
-        <w:t>ys</w:t>
-      </w:r>
-      <w:r>
-        <w:rPr>
-          <w:rStyle w:val="Hyperlink"/>
-        </w:rPr>
-        <w:t>i</w:t>
-      </w:r>
-      <w:r>
-        <w:rPr>
-          <w:rStyle w:val="Hyperlink"/>
-        </w:rPr>
-        <w:t>s</w:t>
+        <w:t>Oscar_DataAnalysis</w:t>
       </w:r>
       <w:proofErr w:type="spellEnd"/>
     </w:p>
@@ -1340,7 +1316,16 @@
       </w:r>
       <w:proofErr w:type="spellEnd"/>
       <w:r>
-        <w:t>, Director(s), ecc.) ed è stata rinominata in modo coerente come “Winners” ovunque, a indicare i vincitori del premio.</w:t>
+        <w:t>, Director(s), ecc.)</w:t>
+      </w:r>
+      <w:r>
+        <w:t xml:space="preserve">, quindi dopo aver filtrato </w:t>
+      </w:r>
+      <w:r>
+        <w:t xml:space="preserve">solo le righe corrispondenti a “Won”, </w:t>
+      </w:r>
+      <w:r>
+        <w:t>è stata rinominata in modo coerente come “Winners” ovunque, a indicare i vincitori del premio.</w:t>
       </w:r>
     </w:p>
     <w:p>
@@ -1440,6 +1425,18 @@
       <w:r>
         <w:t xml:space="preserve"> cifre) e convertito in numero intero, per consentire ordinamenti, filtri per intervallo e raggruppamenti corretti.</w:t>
       </w:r>
+      <w:r>
+        <w:t xml:space="preserve"> Filtrati</w:t>
+      </w:r>
+      <w:r>
+        <w:t xml:space="preserve"> poi</w:t>
+      </w:r>
+      <w:r>
+        <w:t xml:space="preserve"> </w:t>
+      </w:r>
+      <w:r>
+        <w:t>i record solo dal 2000 all’ultima data disponibile.</w:t>
+      </w:r>
     </w:p>
     <w:p>
       <w:pPr>
@@ -1507,10 +1504,23 @@
     </w:p>
     <w:p>
       <w:pPr>
+        <w:spacing w:after="120" w:line="276" w:lineRule="auto"/>
+        <w:jc w:val="both"/>
+      </w:pPr>
+    </w:p>
+    <w:p>
+      <w:pPr>
+        <w:spacing w:after="120" w:line="276" w:lineRule="auto"/>
+        <w:jc w:val="both"/>
+      </w:pPr>
+    </w:p>
+    <w:p>
+      <w:pPr>
         <w:pStyle w:val="Heading1"/>
         <w:jc w:val="both"/>
       </w:pPr>
       <w:r>
+        <w:lastRenderedPageBreak/>
         <w:t>5. Pulizia e selezione della tabella Movies</w:t>
       </w:r>
     </w:p>
@@ -1520,7 +1530,6 @@
         <w:jc w:val="both"/>
       </w:pPr>
       <w:r>
-        <w:lastRenderedPageBreak/>
         <w:t>La tabella dei film (</w:t>
       </w:r>
       <w:proofErr w:type="spellStart"/>
@@ -1578,33 +1587,13 @@
         <w:jc w:val="both"/>
       </w:pPr>
       <w:r>
-        <w:t>5.2 Esclusione della colonna Country</w:t>
-      </w:r>
-    </w:p>
-    <w:p>
-      <w:pPr>
-        <w:spacing w:after="120" w:line="276" w:lineRule="auto"/>
-        <w:jc w:val="both"/>
-      </w:pPr>
-      <w:r>
-        <w:t xml:space="preserve">Valutata ma scartata. La colonna “Country of </w:t>
-      </w:r>
-      <w:proofErr w:type="spellStart"/>
-      <w:r>
-        <w:t>origin</w:t>
-      </w:r>
-      <w:proofErr w:type="spellEnd"/>
-      <w:r>
-        <w:t>” (paese di origine), la più pertinente, era vuota. La colonna “Country” disponibile indicava soltanto i paesi in cui il film era stato girato, un dato di contesto e non una leva su cui un produttore possa agire. Era inoltre incompleta (circa 34% di valori mancanti) e conteneva elenchi multipli di nazionalità in un'unica cella. È stata quindi rimossa in quanto non utile e fonte di rumore.</w:t>
-      </w:r>
-    </w:p>
-    <w:p>
-      <w:pPr>
-        <w:pStyle w:val="Heading2"/>
-        <w:jc w:val="both"/>
-      </w:pPr>
-      <w:r>
-        <w:t>5.3 Lavorazione dei dati economici (Budget e Box office)</w:t>
+        <w:t>5.</w:t>
+      </w:r>
+      <w:r>
+        <w:t>2</w:t>
+      </w:r>
+      <w:r>
+        <w:t xml:space="preserve"> Lavorazione dei dati economici (Budget e Box office)</w:t>
       </w:r>
     </w:p>
     <w:p>
@@ -1867,127 +1856,91 @@
       </w:r>
       <w:proofErr w:type="gramEnd"/>
       <w:r>
-        <w:t xml:space="preserve"> ridotta ai campi rilevanti, con </w:t>
-      </w:r>
-      <w:proofErr w:type="spellStart"/>
-      <w:r>
-        <w:t>Release_Year</w:t>
-      </w:r>
-      <w:proofErr w:type="spellEnd"/>
-      <w:r>
-        <w:t xml:space="preserve"> uniformato dal 2000 e i valori di budget e box office disponibili sia in versione leggibile sia in valore numerico USD.</w:t>
-      </w:r>
-    </w:p>
-    <w:p>
-      <w:pPr>
-        <w:spacing w:after="120" w:line="276" w:lineRule="auto"/>
-        <w:jc w:val="both"/>
-      </w:pPr>
+        <w:t xml:space="preserve"> ridotta ai campi rilevanti, con</w:t>
+      </w:r>
+      <w:r>
+        <w:t xml:space="preserve"> i titoli dei film</w:t>
+      </w:r>
+      <w:r>
+        <w:t xml:space="preserve">, attori </w:t>
+      </w:r>
+      <w:proofErr w:type="gramStart"/>
+      <w:r>
+        <w:t xml:space="preserve">principali, </w:t>
+      </w:r>
+      <w:r>
+        <w:t xml:space="preserve"> regista</w:t>
+      </w:r>
+      <w:proofErr w:type="gramEnd"/>
+      <w:r>
+        <w:t>, produttore</w:t>
+      </w:r>
+      <w:r>
+        <w:t xml:space="preserve">/i, </w:t>
+      </w:r>
+      <w:r>
+        <w:t xml:space="preserve">data di uscita </w:t>
+      </w:r>
+      <w:r>
+        <w:t>e i valori di budget e box office disponibili sia in versione leggibile sia in valore numerico USD</w:t>
+      </w:r>
       <w:r>
         <w:rPr>
           <w:i/>
           <w:iCs/>
         </w:rPr>
-        <w:t>Il collegamento tra le due tabelle avverrà tramite la chiave titolo del film (</w:t>
-      </w:r>
-      <w:proofErr w:type="spellStart"/>
-      <w:r>
-        <w:rPr>
-          <w:i/>
-          <w:iCs/>
-        </w:rPr>
+        <w:t>.</w:t>
+      </w:r>
+    </w:p>
+    <w:p>
+      <w:pPr>
+        <w:pStyle w:val="Heading1"/>
+        <w:jc w:val="both"/>
+      </w:pPr>
+      <w:r>
+        <w:t xml:space="preserve">7. Collegamento delle tabelle: la join </w:t>
+      </w:r>
+      <w:proofErr w:type="spellStart"/>
+      <w:r>
+        <w:t>Movie_Oscar</w:t>
+      </w:r>
+      <w:proofErr w:type="spellEnd"/>
+      <w:r>
+        <w:t xml:space="preserve"> data</w:t>
+      </w:r>
+    </w:p>
+    <w:p>
+      <w:pPr>
+        <w:spacing w:after="120" w:line="276" w:lineRule="auto"/>
+        <w:jc w:val="both"/>
+      </w:pPr>
+      <w:r>
+        <w:t>Per studiare la performance economica dei film premiati è stato necessario collegare il mondo Oscar al mondo film. La chiave di collegamento è il titolo del film (</w:t>
+      </w:r>
+      <w:proofErr w:type="spellStart"/>
+      <w:r>
         <w:t>Oscar_Winners.Film</w:t>
       </w:r>
       <w:proofErr w:type="spellEnd"/>
       <w:r>
-        <w:rPr>
-          <w:i/>
-          <w:iCs/>
-        </w:rPr>
         <w:t xml:space="preserve"> ↔ </w:t>
       </w:r>
       <w:proofErr w:type="spellStart"/>
       <w:r>
-        <w:rPr>
-          <w:i/>
-          <w:iCs/>
-        </w:rPr>
         <w:t>Movies.Title</w:t>
       </w:r>
       <w:proofErr w:type="spellEnd"/>
       <w:r>
-        <w:rPr>
-          <w:i/>
-          <w:iCs/>
-        </w:rPr>
-        <w:t xml:space="preserve">), su cui si baserà </w:t>
-      </w:r>
-      <w:proofErr w:type="spellStart"/>
-      <w:r>
-        <w:rPr>
-          <w:i/>
-          <w:iCs/>
-        </w:rPr>
-        <w:t>l'inner</w:t>
-      </w:r>
-      <w:proofErr w:type="spellEnd"/>
-      <w:r>
-        <w:rPr>
-          <w:i/>
-          <w:iCs/>
-        </w:rPr>
-        <w:t xml:space="preserve"> join per l'analisi di budget e box office dei film premiati.</w:t>
-      </w:r>
-    </w:p>
-    <w:p>
-      <w:pPr>
-        <w:pStyle w:val="Heading1"/>
+        <w:t>): è l'unico campo presente e affidabile in entrambe le tabelle e identifica univocamente il titolo.</w:t>
+      </w:r>
+    </w:p>
+    <w:p>
+      <w:pPr>
+        <w:spacing w:after="120" w:line="276" w:lineRule="auto"/>
         <w:jc w:val="both"/>
       </w:pPr>
       <w:r>
         <w:lastRenderedPageBreak/>
-        <w:t xml:space="preserve">7. Collegamento delle tabelle: la join </w:t>
-      </w:r>
-      <w:proofErr w:type="spellStart"/>
-      <w:r>
-        <w:t>Movie_Oscar</w:t>
-      </w:r>
-      <w:proofErr w:type="spellEnd"/>
-      <w:r>
-        <w:t xml:space="preserve"> data</w:t>
-      </w:r>
-    </w:p>
-    <w:p>
-      <w:pPr>
-        <w:spacing w:after="120" w:line="276" w:lineRule="auto"/>
-        <w:jc w:val="both"/>
-      </w:pPr>
-      <w:r>
-        <w:t>Per studiare la performance economica dei film premiati è stato necessario collegare il mondo Oscar al mondo film. La chiave di collegamento è il titolo del film (</w:t>
-      </w:r>
-      <w:proofErr w:type="spellStart"/>
-      <w:r>
-        <w:t>Oscar_Winners.Film</w:t>
-      </w:r>
-      <w:proofErr w:type="spellEnd"/>
-      <w:r>
-        <w:t xml:space="preserve"> ↔ </w:t>
-      </w:r>
-      <w:proofErr w:type="spellStart"/>
-      <w:r>
-        <w:t>Movies.Title</w:t>
-      </w:r>
-      <w:proofErr w:type="spellEnd"/>
-      <w:r>
-        <w:t>): è l'unico campo presente e affidabile in entrambe le tabelle e identifica univocamente il titolo.</w:t>
-      </w:r>
-    </w:p>
-    <w:p>
-      <w:pPr>
-        <w:spacing w:after="120" w:line="276" w:lineRule="auto"/>
-        <w:jc w:val="both"/>
-      </w:pPr>
-      <w:r>
         <w:t xml:space="preserve">È stato realizzato un </w:t>
       </w:r>
       <w:proofErr w:type="spellStart"/>
@@ -2158,7 +2111,6 @@
         <w:rPr>
           <w:noProof/>
         </w:rPr>
-        <w:lastRenderedPageBreak/>
         <w:drawing>
           <wp:inline distT="0" distB="0" distL="0" distR="0" wp14:anchorId="482DCFE7" wp14:editId="3BBBC5ED">
             <wp:extent cx="5492750" cy="3600450"/>
@@ -2255,6 +2207,7 @@
         <w:jc w:val="both"/>
       </w:pPr>
       <w:r>
+        <w:lastRenderedPageBreak/>
         <w:t xml:space="preserve">8.2 Pagina 2 — Albo dei vincitori (sorgente: </w:t>
       </w:r>
       <w:proofErr w:type="spellStart"/>
@@ -2308,7 +2261,6 @@
         <w:rPr>
           <w:noProof/>
         </w:rPr>
-        <w:lastRenderedPageBreak/>
         <w:drawing>
           <wp:inline distT="0" distB="0" distL="0" distR="0" wp14:anchorId="785229D3" wp14:editId="031B6F41">
             <wp:extent cx="5143500" cy="3705225"/>
@@ -2466,6 +2418,7 @@
         <w:rPr>
           <w:noProof/>
         </w:rPr>
+        <w:lastRenderedPageBreak/>
         <w:drawing>
           <wp:inline distT="0" distB="0" distL="0" distR="0" wp14:anchorId="4E87BDCB" wp14:editId="5319FE07">
             <wp:extent cx="4044950" cy="2913862"/>
@@ -2528,7 +2481,6 @@
         <w:jc w:val="both"/>
       </w:pPr>
       <w:r>
-        <w:lastRenderedPageBreak/>
         <w:t>8.4 Lettura d'insieme</w:t>
       </w:r>
     </w:p>
@@ -2539,6 +2491,61 @@
       </w:pPr>
       <w:r>
         <w:t>Nel complesso la dashboard collega i due filoni dell'analisi: la pagina dei vincitori indica quali figure professionali coinvolgere, mentre le pagine economiche mostrano che il successo di un film premiato non dipende dalla sola dimensione del budget. La presenza di titoli con ROI molto elevato a fronte di budget contenuti suggerisce che, accanto a investimenti importanti, anche progetti più economici ma ben riconosciuti possono offrire ritorni eccellenti — indicazione strategica utile per orientare le scelte di un nuovo produttore.</w:t>
+      </w:r>
+      <w:r>
+        <w:t xml:space="preserve"> </w:t>
+      </w:r>
+    </w:p>
+    <w:p>
+      <w:pPr>
+        <w:spacing w:after="120" w:line="276" w:lineRule="auto"/>
+        <w:jc w:val="both"/>
+      </w:pPr>
+      <w:r>
+        <w:rPr>
+          <w:b/>
+          <w:bCs/>
+        </w:rPr>
+        <w:t>Consigli finali:</w:t>
+      </w:r>
+      <w:r>
+        <w:t xml:space="preserve"> </w:t>
+      </w:r>
+      <w:r>
+        <w:t xml:space="preserve">Se il genere </w:t>
+      </w:r>
+      <w:r>
+        <w:t xml:space="preserve">proposto </w:t>
+      </w:r>
+      <w:r>
+        <w:t xml:space="preserve">è fantasy o sci-fi </w:t>
+      </w:r>
+      <w:r>
+        <w:t xml:space="preserve">bisogna puntare su bravi Visual Artists perché gli effetti visivi incidono molto sulla buona riuscita di un film, ma per qualunche altro genere </w:t>
+      </w:r>
+      <w:r>
+        <w:t>p</w:t>
+      </w:r>
+      <w:r>
+        <w:t>untare su</w:t>
+      </w:r>
+      <w:r>
+        <w:t xml:space="preserve"> attori </w:t>
+      </w:r>
+      <w:r>
+        <w:t xml:space="preserve">e registi </w:t>
+      </w:r>
+      <w:r>
+        <w:t>premiati potrebbe essere la chiave vince</w:t>
+      </w:r>
+      <w:r>
+        <w:t>nt</w:t>
+      </w:r>
+      <w:r>
+        <w:t>e</w:t>
+      </w:r>
+      <w:r>
+        <w:t>.</w:t>
       </w:r>
     </w:p>
     <w:sectPr>

</xml_diff>